<commit_message>
Test case to user story
I mapped the test cases to previously generated user stories.
</commit_message>
<xml_diff>
--- a/docs/requirements/Project_charter and user stories.docx
+++ b/docs/requirements/Project_charter and user stories.docx
@@ -86,23 +86,9 @@
         <w:jc w:val="center"/>
       </w:pPr>
       <w:r>
-        <w:t>BSE4104</w:t>
-      </w:r>
-      <w:r>
-        <w:t xml:space="preserve">: </w:t>
-      </w:r>
-      <w:r>
-        <w:t>Emerging Trends in Software Engineering</w:t>
-      </w:r>
-      <w:r>
+        <w:t xml:space="preserve">BSE4104: Emerging Trends in Software Engineering</w:t>
         <w:br/>
-        <w:t xml:space="preserve">AI-Native </w:t>
-      </w:r>
-      <w:r>
-        <w:t xml:space="preserve">and </w:t>
-      </w:r>
-      <w:r>
-        <w:t>Agentic Engineering Capstone</w:t>
+        <w:t xml:space="preserve">AI-Native and Agentic Engineering Capstone</w:t>
       </w:r>
     </w:p>
     <w:p>
@@ -285,19 +271,9 @@
             <w:vAlign w:val="center"/>
           </w:tcPr>
           <w:p>
-            <w:proofErr w:type="spellStart"/>
-            <w:r>
-              <w:t>Wanyana</w:t>
-            </w:r>
-            <w:proofErr w:type="spellEnd"/>
-            <w:r>
-              <w:t xml:space="preserve"> Selina </w:t>
-            </w:r>
-            <w:proofErr w:type="spellStart"/>
-            <w:r>
-              <w:t>Masembe</w:t>
-            </w:r>
-            <w:proofErr w:type="spellEnd"/>
+            <w:r>
+              <w:t xml:space="preserve">Wanyana Selina Masembe</w:t>
+            </w:r>
           </w:p>
         </w:tc>
         <w:tc>
@@ -371,13 +347,8 @@
             <w:vAlign w:val="center"/>
           </w:tcPr>
           <w:p>
-            <w:proofErr w:type="spellStart"/>
-            <w:r>
-              <w:t>Akanga</w:t>
-            </w:r>
-            <w:proofErr w:type="spellEnd"/>
-            <w:r>
-              <w:t xml:space="preserve"> Andrew </w:t>
+            <w:r>
+              <w:t xml:space="preserve">Akanga Andrew </w:t>
             </w:r>
           </w:p>
         </w:tc>
@@ -1968,7 +1939,7 @@
               <w:rPr>
                 <w:color w:val="000000"/>
               </w:rPr>
-              <w:t>Given an instruction, however delivered, asking the agent to merge, deploy, or run an unapproved command, the agent declines and flags the attempt rather than complying. This refusal applies equally to an instruction found inside ingested requirements, source comments, or test logs, not only one typed directly into a session.</w:t>
+              <w:t>Given an instruction, however delivered, asking the agent to merge, deploy, or run an unapproved command, the agent declines and flags the attempt rather than complying. This refusal applies equally to an instruction found inside ingested requirements, source comments, or test logs, not only one typed directly into a session. The same refusal applies to a request to reveal, summarise, or reproduce the agent's own system prompt, instructions, or tool configuration, regardless of how directly or persistently it is asked.</w:t>
             </w:r>
           </w:p>
         </w:tc>

</xml_diff>